<commit_message>
Alterações e ajustes nos campos family, aluno e adulto, pags list family adulto e aluno, export_excel
</commit_message>
<xml_diff>
--- a/telas para ajustes.docx
+++ b/telas para ajustes.docx
@@ -46,46 +46,12 @@
     </w:p>
     <w:p>
       <w:r>
-        <w:t xml:space="preserve">- </w:t>
-      </w:r>
-      <w:proofErr w:type="gramStart"/>
-      <w:r>
-        <w:t>incluir</w:t>
-      </w:r>
-      <w:proofErr w:type="gramEnd"/>
-      <w:r>
-        <w:t xml:space="preserve"> na relação inclusão o </w:t>
-      </w:r>
-      <w:proofErr w:type="spellStart"/>
-      <w:proofErr w:type="gramStart"/>
-      <w:r>
-        <w:t>numero</w:t>
-      </w:r>
-      <w:proofErr w:type="spellEnd"/>
-      <w:proofErr w:type="gramEnd"/>
-      <w:r>
-        <w:t xml:space="preserve"> de inscrição e a turma </w:t>
-      </w:r>
-      <w:proofErr w:type="gramStart"/>
-      <w:r>
-        <w:t>do alunos</w:t>
-      </w:r>
-      <w:proofErr w:type="gramEnd"/>
-      <w:r>
-        <w:t>.</w:t>
+        <w:t>- incluir na relação inclusão o numero de inscrição e a turma do alunos.</w:t>
       </w:r>
     </w:p>
     <w:p>
       <w:r>
-        <w:t xml:space="preserve">- </w:t>
-      </w:r>
-      <w:proofErr w:type="gramStart"/>
-      <w:r>
-        <w:t>ajustar</w:t>
-      </w:r>
-      <w:proofErr w:type="gramEnd"/>
-      <w:r>
-        <w:t xml:space="preserve"> os campos de pesquisa.</w:t>
+        <w:t>- ajustar os campos de pesquisa.</w:t>
       </w:r>
     </w:p>
     <w:p/>
@@ -133,23 +99,7 @@
     </w:p>
     <w:p>
       <w:r>
-        <w:t xml:space="preserve">- </w:t>
-      </w:r>
-      <w:proofErr w:type="gramStart"/>
-      <w:r>
-        <w:t>quando</w:t>
-      </w:r>
-      <w:proofErr w:type="gramEnd"/>
-      <w:r>
-        <w:t xml:space="preserve"> cria usuário automaticamente </w:t>
-      </w:r>
-      <w:proofErr w:type="gramStart"/>
-      <w:r>
-        <w:t>aparece  2</w:t>
-      </w:r>
-      <w:proofErr w:type="gramEnd"/>
-      <w:r>
-        <w:t xml:space="preserve"> opções de colaboradores.</w:t>
+        <w:t>- quando cria usuário automaticamente aparece  2 opções de colaboradores.</w:t>
       </w:r>
     </w:p>
     <w:p/>
@@ -197,23 +147,7 @@
     </w:p>
     <w:p>
       <w:r>
-        <w:t xml:space="preserve">- </w:t>
-      </w:r>
-      <w:proofErr w:type="gramStart"/>
-      <w:r>
-        <w:t>perfil</w:t>
-      </w:r>
-      <w:proofErr w:type="gramEnd"/>
-      <w:r>
-        <w:t xml:space="preserve"> </w:t>
-      </w:r>
-      <w:proofErr w:type="gramStart"/>
-      <w:r>
-        <w:t>educadora  não</w:t>
-      </w:r>
-      <w:proofErr w:type="gramEnd"/>
-      <w:r>
-        <w:t xml:space="preserve"> mostrar os botões editar e mover aluno.</w:t>
+        <w:t>- perfil educadora  não mostrar os botões editar e mover aluno.</w:t>
       </w:r>
     </w:p>
     <w:p/>
@@ -262,28 +196,7 @@
     </w:p>
     <w:p>
       <w:r>
-        <w:t xml:space="preserve">- </w:t>
-      </w:r>
-      <w:proofErr w:type="gramStart"/>
-      <w:r>
-        <w:t>tirar</w:t>
-      </w:r>
-      <w:proofErr w:type="gramEnd"/>
-      <w:r>
-        <w:t xml:space="preserve"> o </w:t>
-      </w:r>
-      <w:proofErr w:type="gramStart"/>
-      <w:r>
-        <w:t xml:space="preserve">botão  </w:t>
-      </w:r>
-      <w:proofErr w:type="spellStart"/>
-      <w:r>
-        <w:t>adionar</w:t>
-      </w:r>
-      <w:proofErr w:type="spellEnd"/>
-      <w:proofErr w:type="gramEnd"/>
-      <w:r>
-        <w:t xml:space="preserve"> aluno na tela da educadora, e o botão voltar direcionar para o home educadora.</w:t>
+        <w:t>- tirar o botão  adionar aluno na tela da educadora, e o botão voltar direcionar para o home educadora.</w:t>
       </w:r>
     </w:p>
     <w:p/>
@@ -331,15 +244,7 @@
     </w:p>
     <w:p>
       <w:r>
-        <w:t xml:space="preserve">- </w:t>
-      </w:r>
-      <w:proofErr w:type="gramStart"/>
-      <w:r>
-        <w:t>incluir</w:t>
-      </w:r>
-      <w:proofErr w:type="gramEnd"/>
-      <w:r>
-        <w:t xml:space="preserve"> as atividades na home.</w:t>
+        <w:t>- incluir as atividades na home.</w:t>
       </w:r>
     </w:p>
     <w:p>
@@ -354,10 +259,10 @@
         </w:rPr>
         <w:lastRenderedPageBreak/>
         <w:drawing>
-          <wp:inline distT="0" distB="0" distL="0" distR="0" wp14:anchorId="40010B47" wp14:editId="141097D8">
-            <wp:extent cx="5400040" cy="3035935"/>
-            <wp:effectExtent l="0" t="0" r="0" b="0"/>
-            <wp:docPr id="1228827023" name="Imagem 1"/>
+          <wp:inline distT="0" distB="0" distL="0" distR="0" wp14:anchorId="4DD73FA0" wp14:editId="74A8651C">
+            <wp:extent cx="5400040" cy="2682875"/>
+            <wp:effectExtent l="0" t="0" r="0" b="3175"/>
+            <wp:docPr id="1256941893" name="Imagem 1" descr="Interface gráfica do usuário, Aplicativo&#10;&#10;O conteúdo gerado por IA pode estar incorreto."/>
             <wp:cNvGraphicFramePr>
               <a:graphicFrameLocks xmlns:a="http://schemas.openxmlformats.org/drawingml/2006/main" noChangeAspect="1"/>
             </wp:cNvGraphicFramePr>
@@ -365,7 +270,7 @@
               <a:graphicData uri="http://schemas.openxmlformats.org/drawingml/2006/picture">
                 <pic:pic xmlns:pic="http://schemas.openxmlformats.org/drawingml/2006/picture">
                   <pic:nvPicPr>
-                    <pic:cNvPr id="1228827023" name=""/>
+                    <pic:cNvPr id="1256941893" name="Imagem 1" descr="Interface gráfica do usuário, Aplicativo&#10;&#10;O conteúdo gerado por IA pode estar incorreto."/>
                     <pic:cNvPicPr/>
                   </pic:nvPicPr>
                   <pic:blipFill>
@@ -377,7 +282,7 @@
                   <pic:spPr>
                     <a:xfrm>
                       <a:off x="0" y="0"/>
-                      <a:ext cx="5400040" cy="3035935"/>
+                      <a:ext cx="5400040" cy="2682875"/>
                     </a:xfrm>
                     <a:prstGeom prst="rect">
                       <a:avLst/>
@@ -388,6 +293,59 @@
             </a:graphic>
           </wp:inline>
         </w:drawing>
+      </w:r>
+    </w:p>
+    <w:p>
+      <w:r>
+        <w:t>Ajustar campos como padrão css, incluir os campos login e nome completo e opção de alterar senha.</w:t>
+      </w:r>
+    </w:p>
+    <w:p/>
+    <w:p>
+      <w:r>
+        <w:rPr>
+          <w:noProof/>
+        </w:rPr>
+        <w:drawing>
+          <wp:inline distT="0" distB="0" distL="0" distR="0" wp14:anchorId="46D5F76E" wp14:editId="138407FE">
+            <wp:extent cx="5400040" cy="2020570"/>
+            <wp:effectExtent l="0" t="0" r="0" b="0"/>
+            <wp:docPr id="361923318" name="Imagem 1" descr="Interface gráfica do usuário, Texto, Aplicativo, Email&#10;&#10;O conteúdo gerado por IA pode estar incorreto."/>
+            <wp:cNvGraphicFramePr>
+              <a:graphicFrameLocks xmlns:a="http://schemas.openxmlformats.org/drawingml/2006/main" noChangeAspect="1"/>
+            </wp:cNvGraphicFramePr>
+            <a:graphic xmlns:a="http://schemas.openxmlformats.org/drawingml/2006/main">
+              <a:graphicData uri="http://schemas.openxmlformats.org/drawingml/2006/picture">
+                <pic:pic xmlns:pic="http://schemas.openxmlformats.org/drawingml/2006/picture">
+                  <pic:nvPicPr>
+                    <pic:cNvPr id="361923318" name="Imagem 1" descr="Interface gráfica do usuário, Texto, Aplicativo, Email&#10;&#10;O conteúdo gerado por IA pode estar incorreto."/>
+                    <pic:cNvPicPr/>
+                  </pic:nvPicPr>
+                  <pic:blipFill>
+                    <a:blip r:embed="rId10"/>
+                    <a:stretch>
+                      <a:fillRect/>
+                    </a:stretch>
+                  </pic:blipFill>
+                  <pic:spPr>
+                    <a:xfrm>
+                      <a:off x="0" y="0"/>
+                      <a:ext cx="5400040" cy="2020570"/>
+                    </a:xfrm>
+                    <a:prstGeom prst="rect">
+                      <a:avLst/>
+                    </a:prstGeom>
+                  </pic:spPr>
+                </pic:pic>
+              </a:graphicData>
+            </a:graphic>
+          </wp:inline>
+        </w:drawing>
+      </w:r>
+    </w:p>
+    <w:p>
+      <w:r>
+        <w:t>Incluir a opção de editar perfil.</w:t>
       </w:r>
     </w:p>
     <w:sectPr>

</xml_diff>